<commit_message>
refactor(prata): converte view de sindrome gripal em tabela física persistida
- Substitui a antiga view por tabela física (SELECT INTO) para garantir alta performance nas consultas.
- Habilita o uso nativo de operações DML (UPDATE/DELETE) que eram bloqueadas pela view.
- Mantém a padronização de limpeza de nulos, correção de caracteres e conversão de tipos (datas, inteiros e flags).
</commit_message>
<xml_diff>
--- a/docs/RELATÓRIO TÉCNICO.docx
+++ b/docs/RELATÓRIO TÉCNICO.docx
@@ -3500,6 +3500,711 @@
         <w:t>- Dashboard estruturado com hierarquia geográfica (Região &gt; UF &gt; Município) e filtros dinâmicos.</w:t>
       </w:r>
     </w:p>
+    <w:p/>
+    <w:p/>
+    <w:p/>
+    <w:p>
+      <w:r>
+        <w:t>Novas notas:</w:t>
+      </w:r>
+      <w:r>
+        <w:br/>
+      </w:r>
+      <w:r>
+        <w:t>-- 3b.</w:t>
+      </w:r>
+      <w:r>
+        <w:tab/>
+        <w:t xml:space="preserve">Em sintaxe </w:t>
+      </w:r>
+      <w:proofErr w:type="spellStart"/>
+      <w:r>
+        <w:t>sql</w:t>
+      </w:r>
+      <w:proofErr w:type="spellEnd"/>
+      <w:r>
+        <w:t xml:space="preserve"> do </w:t>
+      </w:r>
+      <w:proofErr w:type="spellStart"/>
+      <w:r>
+        <w:t>sql</w:t>
+      </w:r>
+      <w:proofErr w:type="spellEnd"/>
+      <w:r>
+        <w:t xml:space="preserve"> server;</w:t>
+      </w:r>
+    </w:p>
+    <w:p>
+      <w:r>
+        <w:t>-- i.</w:t>
+      </w:r>
+      <w:r>
+        <w:tab/>
+        <w:t xml:space="preserve">A consulta por uf deve permitir o filtro das </w:t>
+      </w:r>
+      <w:proofErr w:type="spellStart"/>
+      <w:r>
+        <w:t>ufs</w:t>
+      </w:r>
+      <w:proofErr w:type="spellEnd"/>
+      <w:r>
+        <w:t xml:space="preserve"> em uma lista.</w:t>
+      </w:r>
+    </w:p>
+    <w:p/>
+    <w:p>
+      <w:r>
+        <w:t xml:space="preserve">USE </w:t>
+      </w:r>
+      <w:proofErr w:type="spellStart"/>
+      <w:r>
+        <w:t>opendatasus</w:t>
+      </w:r>
+      <w:proofErr w:type="spellEnd"/>
+      <w:r>
+        <w:t>;</w:t>
+      </w:r>
+    </w:p>
+    <w:p>
+      <w:r>
+        <w:t>GO</w:t>
+      </w:r>
+    </w:p>
+    <w:p/>
+    <w:p>
+      <w:r>
+        <w:t xml:space="preserve">SELECT </w:t>
+      </w:r>
+    </w:p>
+    <w:p>
+      <w:r>
+        <w:t xml:space="preserve">    estado,</w:t>
+      </w:r>
+    </w:p>
+    <w:p>
+      <w:r>
+        <w:t xml:space="preserve">    </w:t>
+      </w:r>
+      <w:proofErr w:type="gramStart"/>
+      <w:r>
+        <w:t>COUNT(</w:t>
+      </w:r>
+      <w:proofErr w:type="spellStart"/>
+      <w:proofErr w:type="gramEnd"/>
+      <w:r>
+        <w:t>sourceId</w:t>
+      </w:r>
+      <w:proofErr w:type="spellEnd"/>
+      <w:r>
+        <w:t xml:space="preserve">) AS </w:t>
+      </w:r>
+      <w:proofErr w:type="spellStart"/>
+      <w:r>
+        <w:t>totalNotificacoes</w:t>
+      </w:r>
+      <w:proofErr w:type="spellEnd"/>
+    </w:p>
+    <w:p>
+      <w:r>
+        <w:t xml:space="preserve">FROM </w:t>
+      </w:r>
+      <w:proofErr w:type="spellStart"/>
+      <w:proofErr w:type="gramStart"/>
+      <w:r>
+        <w:t>dbo.vw</w:t>
+      </w:r>
+      <w:proofErr w:type="gramEnd"/>
+      <w:r>
+        <w:t>_prata_sindrome_gripal</w:t>
+      </w:r>
+      <w:proofErr w:type="spellEnd"/>
+    </w:p>
+    <w:p>
+      <w:r>
+        <w:t>WHERE estado IN ('São Paulo', 'Rio de Janeiro', 'Minas Gerais', 'Paraná')</w:t>
+      </w:r>
+    </w:p>
+    <w:p>
+      <w:r>
+        <w:t>GROUP BY estado</w:t>
+      </w:r>
+    </w:p>
+    <w:p>
+      <w:r>
+        <w:t xml:space="preserve">ORDER BY </w:t>
+      </w:r>
+      <w:proofErr w:type="spellStart"/>
+      <w:r>
+        <w:t>totalNotificacoes</w:t>
+      </w:r>
+      <w:proofErr w:type="spellEnd"/>
+      <w:r>
+        <w:t xml:space="preserve"> DESC;</w:t>
+      </w:r>
+    </w:p>
+    <w:p>
+      <w:r>
+        <w:t>GO</w:t>
+      </w:r>
+    </w:p>
+    <w:p/>
+    <w:p>
+      <w:r>
+        <w:t xml:space="preserve">-- </w:t>
+      </w:r>
+      <w:proofErr w:type="spellStart"/>
+      <w:r>
+        <w:t>ii</w:t>
+      </w:r>
+      <w:proofErr w:type="spellEnd"/>
+      <w:r>
+        <w:t>.</w:t>
+      </w:r>
+      <w:r>
+        <w:tab/>
+        <w:t>A consulta por cidade deve trazer as cidades cuja contagem seja acima de 10.</w:t>
+      </w:r>
+    </w:p>
+    <w:p>
+      <w:r>
+        <w:lastRenderedPageBreak/>
+        <w:t xml:space="preserve">USE </w:t>
+      </w:r>
+      <w:proofErr w:type="spellStart"/>
+      <w:r>
+        <w:t>opendatasus</w:t>
+      </w:r>
+      <w:proofErr w:type="spellEnd"/>
+      <w:r>
+        <w:t>;</w:t>
+      </w:r>
+    </w:p>
+    <w:p>
+      <w:r>
+        <w:t>GO</w:t>
+      </w:r>
+    </w:p>
+    <w:p/>
+    <w:p>
+      <w:r>
+        <w:t xml:space="preserve">SELECT </w:t>
+      </w:r>
+    </w:p>
+    <w:p>
+      <w:r>
+        <w:t xml:space="preserve">    </w:t>
+      </w:r>
+      <w:proofErr w:type="spellStart"/>
+      <w:r>
+        <w:t>m.nomeUf</w:t>
+      </w:r>
+      <w:proofErr w:type="spellEnd"/>
+      <w:r>
+        <w:t xml:space="preserve"> AS estado,</w:t>
+      </w:r>
+    </w:p>
+    <w:p>
+      <w:r>
+        <w:t xml:space="preserve">    </w:t>
+      </w:r>
+      <w:proofErr w:type="spellStart"/>
+      <w:r>
+        <w:t>m.nomeMunicipio</w:t>
+      </w:r>
+      <w:proofErr w:type="spellEnd"/>
+      <w:r>
+        <w:t xml:space="preserve"> AS </w:t>
+      </w:r>
+      <w:proofErr w:type="spellStart"/>
+      <w:r>
+        <w:t>municipio</w:t>
+      </w:r>
+      <w:proofErr w:type="spellEnd"/>
+      <w:r>
+        <w:t>,</w:t>
+      </w:r>
+    </w:p>
+    <w:p>
+      <w:r>
+        <w:t xml:space="preserve">    </w:t>
+      </w:r>
+      <w:proofErr w:type="spellStart"/>
+      <w:r>
+        <w:t>m.codigoMunicipioCompleto</w:t>
+      </w:r>
+      <w:proofErr w:type="spellEnd"/>
+      <w:r>
+        <w:t xml:space="preserve"> AS </w:t>
+      </w:r>
+      <w:proofErr w:type="spellStart"/>
+      <w:r>
+        <w:t>ibge</w:t>
+      </w:r>
+      <w:proofErr w:type="spellEnd"/>
+      <w:r>
+        <w:t>,</w:t>
+      </w:r>
+    </w:p>
+    <w:p>
+      <w:r>
+        <w:t xml:space="preserve">    COUNT(</w:t>
+      </w:r>
+      <w:proofErr w:type="spellStart"/>
+      <w:proofErr w:type="gramStart"/>
+      <w:r>
+        <w:t>s.sourceId</w:t>
+      </w:r>
+      <w:proofErr w:type="spellEnd"/>
+      <w:proofErr w:type="gramEnd"/>
+      <w:r>
+        <w:t xml:space="preserve">) AS </w:t>
+      </w:r>
+      <w:proofErr w:type="spellStart"/>
+      <w:r>
+        <w:t>totalNotificacoes</w:t>
+      </w:r>
+      <w:proofErr w:type="spellEnd"/>
+    </w:p>
+    <w:p>
+      <w:r>
+        <w:t xml:space="preserve">FROM </w:t>
+      </w:r>
+      <w:proofErr w:type="spellStart"/>
+      <w:proofErr w:type="gramStart"/>
+      <w:r>
+        <w:t>dbo.vw</w:t>
+      </w:r>
+      <w:proofErr w:type="gramEnd"/>
+      <w:r>
+        <w:t>_prata_sindrome_gripal</w:t>
+      </w:r>
+      <w:proofErr w:type="spellEnd"/>
+      <w:r>
+        <w:t xml:space="preserve"> s</w:t>
+      </w:r>
+    </w:p>
+    <w:p>
+      <w:r>
+        <w:t xml:space="preserve">INNER JOIN </w:t>
+      </w:r>
+      <w:proofErr w:type="spellStart"/>
+      <w:r>
+        <w:t>dbo.dim_municipios</w:t>
+      </w:r>
+      <w:proofErr w:type="spellEnd"/>
+      <w:r>
+        <w:t xml:space="preserve"> m </w:t>
+      </w:r>
+    </w:p>
+    <w:p>
+      <w:r>
+        <w:t xml:space="preserve">    ON </w:t>
+      </w:r>
+      <w:proofErr w:type="spellStart"/>
+      <w:proofErr w:type="gramStart"/>
+      <w:r>
+        <w:t>s.municipio</w:t>
+      </w:r>
+      <w:proofErr w:type="spellEnd"/>
+      <w:proofErr w:type="gramEnd"/>
+      <w:r>
+        <w:t xml:space="preserve"> = </w:t>
+      </w:r>
+      <w:proofErr w:type="spellStart"/>
+      <w:proofErr w:type="gramStart"/>
+      <w:r>
+        <w:t>m.nomeMunicipio</w:t>
+      </w:r>
+      <w:proofErr w:type="spellEnd"/>
+      <w:proofErr w:type="gramEnd"/>
+    </w:p>
+    <w:p>
+      <w:r>
+        <w:t xml:space="preserve">   AND </w:t>
+      </w:r>
+      <w:proofErr w:type="spellStart"/>
+      <w:proofErr w:type="gramStart"/>
+      <w:r>
+        <w:t>s.estado</w:t>
+      </w:r>
+      <w:proofErr w:type="spellEnd"/>
+      <w:proofErr w:type="gramEnd"/>
+      <w:r>
+        <w:t xml:space="preserve"> = </w:t>
+      </w:r>
+      <w:proofErr w:type="spellStart"/>
+      <w:proofErr w:type="gramStart"/>
+      <w:r>
+        <w:t>m.nomeUf</w:t>
+      </w:r>
+      <w:proofErr w:type="spellEnd"/>
+      <w:proofErr w:type="gramEnd"/>
+    </w:p>
+    <w:p>
+      <w:r>
+        <w:t xml:space="preserve">GROUP BY </w:t>
+      </w:r>
+      <w:proofErr w:type="spellStart"/>
+      <w:proofErr w:type="gramStart"/>
+      <w:r>
+        <w:t>m.nomeUf</w:t>
+      </w:r>
+      <w:proofErr w:type="spellEnd"/>
+      <w:proofErr w:type="gramEnd"/>
+      <w:r>
+        <w:t xml:space="preserve">, </w:t>
+      </w:r>
+      <w:proofErr w:type="spellStart"/>
+      <w:proofErr w:type="gramStart"/>
+      <w:r>
+        <w:t>m.nomeMunicipio</w:t>
+      </w:r>
+      <w:proofErr w:type="spellEnd"/>
+      <w:proofErr w:type="gramEnd"/>
+      <w:r>
+        <w:t xml:space="preserve">, </w:t>
+      </w:r>
+      <w:proofErr w:type="spellStart"/>
+      <w:proofErr w:type="gramStart"/>
+      <w:r>
+        <w:t>m.codigoMunicipioCompleto</w:t>
+      </w:r>
+      <w:proofErr w:type="spellEnd"/>
+      <w:proofErr w:type="gramEnd"/>
+    </w:p>
+    <w:p>
+      <w:r>
+        <w:t>HAVING COUNT(</w:t>
+      </w:r>
+      <w:proofErr w:type="spellStart"/>
+      <w:proofErr w:type="gramStart"/>
+      <w:r>
+        <w:t>s.sourceId</w:t>
+      </w:r>
+      <w:proofErr w:type="spellEnd"/>
+      <w:proofErr w:type="gramEnd"/>
+      <w:r>
+        <w:t>) &gt; 10</w:t>
+      </w:r>
+    </w:p>
+    <w:p>
+      <w:r>
+        <w:t xml:space="preserve">ORDER BY </w:t>
+      </w:r>
+      <w:proofErr w:type="spellStart"/>
+      <w:r>
+        <w:t>totalNotificacoes</w:t>
+      </w:r>
+      <w:proofErr w:type="spellEnd"/>
+      <w:r>
+        <w:t xml:space="preserve"> DESC;</w:t>
+      </w:r>
+    </w:p>
+    <w:p>
+      <w:r>
+        <w:t>GO</w:t>
+      </w:r>
+    </w:p>
+    <w:p/>
+    <w:p/>
+    <w:p>
+      <w:r>
+        <w:t>-- 3c. A partir da tabela de dados da síndrome gripal:</w:t>
+      </w:r>
+    </w:p>
+    <w:p>
+      <w:r>
+        <w:t xml:space="preserve">-- </w:t>
+      </w:r>
+      <w:proofErr w:type="spellStart"/>
+      <w:r>
+        <w:t>c.i</w:t>
+      </w:r>
+      <w:proofErr w:type="spellEnd"/>
+      <w:r>
+        <w:t>. Criação de uma nova tabela contendo apenas os dados do estado de São Paulo</w:t>
+      </w:r>
+    </w:p>
+    <w:p>
+      <w:r>
+        <w:t xml:space="preserve">USE </w:t>
+      </w:r>
+      <w:proofErr w:type="spellStart"/>
+      <w:r>
+        <w:t>opendatasus</w:t>
+      </w:r>
+      <w:proofErr w:type="spellEnd"/>
+      <w:r>
+        <w:t>;</w:t>
+      </w:r>
+    </w:p>
+    <w:p>
+      <w:r>
+        <w:t>GO</w:t>
+      </w:r>
+    </w:p>
+    <w:p/>
+    <w:p>
+      <w:r>
+        <w:t>-- Se a tabela já existir por algum teste anterior, podemos apagá-la com segurança antes de recriar:</w:t>
+      </w:r>
+    </w:p>
+    <w:p>
+      <w:r>
+        <w:t>IF OBJECT_</w:t>
+      </w:r>
+      <w:proofErr w:type="gramStart"/>
+      <w:r>
+        <w:t>ID(</w:t>
+      </w:r>
+      <w:proofErr w:type="gramEnd"/>
+      <w:r>
+        <w:t>'</w:t>
+      </w:r>
+      <w:proofErr w:type="spellStart"/>
+      <w:proofErr w:type="gramStart"/>
+      <w:r>
+        <w:t>dbo.tb</w:t>
+      </w:r>
+      <w:proofErr w:type="gramEnd"/>
+      <w:r>
+        <w:t>_sindrome_gripal_sp</w:t>
+      </w:r>
+      <w:proofErr w:type="spellEnd"/>
+      <w:r>
+        <w:t>', 'U') IS NOT NULL</w:t>
+      </w:r>
+    </w:p>
+    <w:p>
+      <w:r>
+        <w:t xml:space="preserve">    DROP TABLE </w:t>
+      </w:r>
+      <w:proofErr w:type="spellStart"/>
+      <w:proofErr w:type="gramStart"/>
+      <w:r>
+        <w:t>dbo.tb</w:t>
+      </w:r>
+      <w:proofErr w:type="gramEnd"/>
+      <w:r>
+        <w:t>_sindrome_gripal_sp</w:t>
+      </w:r>
+      <w:proofErr w:type="spellEnd"/>
+      <w:r>
+        <w:t>;</w:t>
+      </w:r>
+    </w:p>
+    <w:p>
+      <w:r>
+        <w:t>GO</w:t>
+      </w:r>
+    </w:p>
+    <w:p/>
+    <w:p>
+      <w:r>
+        <w:t>-- Criação e carga da nova tabela filtrando apenas por São Paulo</w:t>
+      </w:r>
+    </w:p>
+    <w:p>
+      <w:r>
+        <w:t>SELECT *</w:t>
+      </w:r>
+    </w:p>
+    <w:p>
+      <w:r>
+        <w:lastRenderedPageBreak/>
+        <w:t xml:space="preserve">INTO </w:t>
+      </w:r>
+      <w:proofErr w:type="spellStart"/>
+      <w:proofErr w:type="gramStart"/>
+      <w:r>
+        <w:t>dbo.tb</w:t>
+      </w:r>
+      <w:proofErr w:type="gramEnd"/>
+      <w:r>
+        <w:t>_sindrome_gripal_sp</w:t>
+      </w:r>
+      <w:proofErr w:type="spellEnd"/>
+    </w:p>
+    <w:p>
+      <w:r>
+        <w:t xml:space="preserve">FROM </w:t>
+      </w:r>
+      <w:proofErr w:type="spellStart"/>
+      <w:proofErr w:type="gramStart"/>
+      <w:r>
+        <w:t>dbo.vw</w:t>
+      </w:r>
+      <w:proofErr w:type="gramEnd"/>
+      <w:r>
+        <w:t>_prata_sindrome_gripal</w:t>
+      </w:r>
+      <w:proofErr w:type="spellEnd"/>
+    </w:p>
+    <w:p>
+      <w:r>
+        <w:t>WHERE estado = 'São Paulo';</w:t>
+      </w:r>
+    </w:p>
+    <w:p>
+      <w:r>
+        <w:t>GO</w:t>
+      </w:r>
+    </w:p>
+    <w:p/>
+    <w:p>
+      <w:r>
+        <w:t>-- Validação rápida para conferir se os dados foram gravados</w:t>
+      </w:r>
+    </w:p>
+    <w:p>
+      <w:r>
+        <w:t xml:space="preserve">SELECT TOP 10 estado, </w:t>
+      </w:r>
+      <w:proofErr w:type="spellStart"/>
+      <w:r>
+        <w:t>municipio</w:t>
+      </w:r>
+      <w:proofErr w:type="spellEnd"/>
+      <w:r>
+        <w:t xml:space="preserve">, </w:t>
+      </w:r>
+      <w:proofErr w:type="gramStart"/>
+      <w:r>
+        <w:t>COUNT(</w:t>
+      </w:r>
+      <w:proofErr w:type="gramEnd"/>
+      <w:r>
+        <w:t xml:space="preserve">*) </w:t>
+      </w:r>
+      <w:proofErr w:type="gramStart"/>
+      <w:r>
+        <w:t>AS total</w:t>
+      </w:r>
+      <w:proofErr w:type="gramEnd"/>
+    </w:p>
+    <w:p>
+      <w:r>
+        <w:t xml:space="preserve">FROM </w:t>
+      </w:r>
+      <w:proofErr w:type="spellStart"/>
+      <w:proofErr w:type="gramStart"/>
+      <w:r>
+        <w:t>dbo.tb</w:t>
+      </w:r>
+      <w:proofErr w:type="gramEnd"/>
+      <w:r>
+        <w:t>_sindrome_gripal_sp</w:t>
+      </w:r>
+      <w:proofErr w:type="spellEnd"/>
+    </w:p>
+    <w:p>
+      <w:r>
+        <w:t xml:space="preserve">GROUP BY estado, </w:t>
+      </w:r>
+      <w:proofErr w:type="spellStart"/>
+      <w:r>
+        <w:t>municipio</w:t>
+      </w:r>
+      <w:proofErr w:type="spellEnd"/>
+      <w:r>
+        <w:t>;</w:t>
+      </w:r>
+    </w:p>
+    <w:p>
+      <w:r>
+        <w:t>GO</w:t>
+      </w:r>
+    </w:p>
+    <w:p/>
+    <w:p/>
+    <w:p/>
+    <w:p/>
+    <w:p>
+      <w:r>
+        <w:t>-- Diagnóstico: Visualizar quais valores de estado estão nulos, vazios ou indefinidos</w:t>
+      </w:r>
+    </w:p>
+    <w:p>
+      <w:r>
+        <w:t xml:space="preserve">USE </w:t>
+      </w:r>
+      <w:proofErr w:type="spellStart"/>
+      <w:r>
+        <w:t>opendatasus</w:t>
+      </w:r>
+      <w:proofErr w:type="spellEnd"/>
+      <w:r>
+        <w:t>;</w:t>
+      </w:r>
+    </w:p>
+    <w:p>
+      <w:r>
+        <w:t>GO</w:t>
+      </w:r>
+    </w:p>
+    <w:p/>
+    <w:p>
+      <w:r>
+        <w:t xml:space="preserve">SELECT </w:t>
+      </w:r>
+      <w:proofErr w:type="spellStart"/>
+      <w:r>
+        <w:t>distinct</w:t>
+      </w:r>
+      <w:proofErr w:type="spellEnd"/>
+    </w:p>
+    <w:p>
+      <w:r>
+        <w:t xml:space="preserve">    </w:t>
+      </w:r>
+      <w:proofErr w:type="spellStart"/>
+      <w:r>
+        <w:t>estadoIBGE</w:t>
+      </w:r>
+      <w:proofErr w:type="spellEnd"/>
+      <w:r>
+        <w:t>,</w:t>
+      </w:r>
+    </w:p>
+    <w:p>
+      <w:r>
+        <w:tab/>
+      </w:r>
+      <w:proofErr w:type="spellStart"/>
+      <w:r>
+        <w:t>estadoNotificacaoIBGE</w:t>
+      </w:r>
+      <w:proofErr w:type="spellEnd"/>
+      <w:r>
+        <w:t xml:space="preserve"> </w:t>
+      </w:r>
+    </w:p>
+    <w:p>
+      <w:r>
+        <w:t xml:space="preserve">   </w:t>
+      </w:r>
+    </w:p>
+    <w:p>
+      <w:r>
+        <w:t xml:space="preserve">FROM </w:t>
+      </w:r>
+      <w:proofErr w:type="spellStart"/>
+      <w:proofErr w:type="gramStart"/>
+      <w:r>
+        <w:t>dbo.vw</w:t>
+      </w:r>
+      <w:proofErr w:type="gramEnd"/>
+      <w:r>
+        <w:t>_prata_sindrome_gripal</w:t>
+      </w:r>
+      <w:proofErr w:type="spellEnd"/>
+      <w:r>
+        <w:t xml:space="preserve"> </w:t>
+      </w:r>
+    </w:p>
+    <w:p/>
+    <w:p/>
+    <w:p/>
     <w:sectPr>
       <w:pgSz w:w="11906" w:h="16838"/>
       <w:pgMar w:top="1417" w:right="1701" w:bottom="1417" w:left="1701" w:header="708" w:footer="708" w:gutter="0"/>

</xml_diff>